<commit_message>
finished written response questions
</commit_message>
<xml_diff>
--- a/lab3/lab3.docx
+++ b/lab3/lab3.docx
@@ -13,10 +13,116 @@
     <w:p/>
     <w:p>
       <w:pPr>
+        <w:pStyle w:val="ListParagraph"/>
+        <w:numPr>
+          <w:ilvl w:val="0"/>
+          <w:numId w:val="2"/>
+        </w:numPr>
+      </w:pPr>
+      <w:r>
+        <w:t>BSTS are better than sorted arrays since searching insertions and deletions in a sorted array requires shifting elements – this takes O(n) time. In a balanced BST, insertions and deletions take O(log n) time, so it can handle frequent changes much more efficiently.</w:t>
+      </w:r>
+      <w:r>
+        <w:br/>
+      </w:r>
+      <w:r>
+        <w:br/>
+        <w:t>A BST is better than an unsorted linked list for searching for the same reason: linked lists require scanning every item (O(n)) while balanced BSTs can search in O(log n).</w:t>
+      </w:r>
+    </w:p>
+    <w:p/>
+    <w:p>
+      <w:pPr>
+        <w:pStyle w:val="ListParagraph"/>
+        <w:numPr>
+          <w:ilvl w:val="0"/>
+          <w:numId w:val="2"/>
+        </w:numPr>
+      </w:pPr>
+      <w:r>
+        <w:t>The height of the BST determines how many operations take place. Searching, inserting, and deleting all follow a path from the root down the tree, thus the time is proportional to the tree’s height. Taller tree = slower operations.</w:t>
+      </w:r>
+      <w:r>
+        <w:br/>
+      </w:r>
+      <w:r>
+        <w:br/>
+        <w:t>Worst case height is n – 1 (for a BST with n nodes). This is pretty much just a linked list with time complexity O(n). This happens when the tree is completely unbalanced, and insertions are in order.</w:t>
+      </w:r>
+    </w:p>
+    <w:p/>
+    <w:p>
+      <w:pPr>
+        <w:pStyle w:val="ListParagraph"/>
+        <w:numPr>
+          <w:ilvl w:val="0"/>
+          <w:numId w:val="2"/>
+        </w:numPr>
+      </w:pPr>
+      <w:r>
+        <w:t xml:space="preserve">Deleting a leaf node simply requires freeing the node and setting the pointer pointing towards it to null. Deleting a node with one child is the same, but modifying the previous node such that it points to the node after the deleted node. Both of these operations are very simple. </w:t>
+      </w:r>
+      <w:r>
+        <w:br/>
+      </w:r>
+      <w:r>
+        <w:br/>
+        <w:t>Deleting a node with two children requires the program to search for a suitable candidate node. This means, from the deleted node, going left once and right all the way. This finds the node that is right before the deleted node in terms of value. Then, the program replaces the node to be deleted with the found node. The node to be deleted is then freed and replaced with the found node. This ensures that the order of the BST is not broken. Thus, the BST is still sorted.</w:t>
+      </w:r>
+    </w:p>
+    <w:p>
+      <w:pPr>
+        <w:pStyle w:val="ListParagraph"/>
+      </w:pPr>
+    </w:p>
+    <w:p/>
+    <w:p>
+      <w:pPr>
         <w:pStyle w:val="Heading1"/>
       </w:pPr>
       <w:r>
+        <w:lastRenderedPageBreak/>
         <w:t>Part 2</w:t>
+      </w:r>
+    </w:p>
+    <w:p/>
+    <w:p>
+      <w:pPr>
+        <w:pStyle w:val="ListParagraph"/>
+        <w:numPr>
+          <w:ilvl w:val="0"/>
+          <w:numId w:val="4"/>
+        </w:numPr>
+      </w:pPr>
+      <w:r>
+        <w:t>In a binary tree, every left subtree has to contain smaller values and every right tree has to contain larger values. In order traversal visits the nodes in the order left-&gt;root-&gt;right. If the tree is a valid BST, this traversal will naturally list all the values in sorted order.</w:t>
+      </w:r>
+      <w:r>
+        <w:br/>
+      </w:r>
+      <w:r>
+        <w:br/>
+        <w:t>The output sequence has to be increasing. If any value is not in order, the tree is not a valid BST.</w:t>
+      </w:r>
+    </w:p>
+    <w:p/>
+    <w:p>
+      <w:pPr>
+        <w:pStyle w:val="ListParagraph"/>
+        <w:numPr>
+          <w:ilvl w:val="0"/>
+          <w:numId w:val="4"/>
+        </w:numPr>
+      </w:pPr>
+      <w:r>
+        <w:t>Treating duplicates as updates makes sense in this context (employee database). Each employee should have one authoritative record, and any new information should replace old information. This prevents confusion from conflicts or clutter.</w:t>
+      </w:r>
+      <w:r>
+        <w:br/>
+      </w:r>
+      <w:r>
+        <w:br/>
+        <w:t xml:space="preserve">A notable trade-off is that historical versions are lost unless stored elsewhere. Furthermore, if an update is incorrect, old data is overwritten. </w:t>
       </w:r>
     </w:p>
     <w:sectPr>
@@ -27,6 +133,379 @@
     </w:sectPr>
   </w:body>
 </w:document>
+</file>
+
+<file path=word/numbering.xml><?xml version="1.0" encoding="utf-8"?>
+<w:numbering xmlns:wpc="http://schemas.microsoft.com/office/word/2010/wordprocessingCanvas" xmlns:cx="http://schemas.microsoft.com/office/drawing/2014/chartex" xmlns:cx1="http://schemas.microsoft.com/office/drawing/2015/9/8/chartex" xmlns:cx2="http://schemas.microsoft.com/office/drawing/2015/10/21/chartex" xmlns:cx3="http://schemas.microsoft.com/office/drawing/2016/5/9/chartex" xmlns:cx4="http://schemas.microsoft.com/office/drawing/2016/5/10/chartex" xmlns:cx5="http://schemas.microsoft.com/office/drawing/2016/5/11/chartex" xmlns:cx6="http://schemas.microsoft.com/office/drawing/2016/5/12/chartex" xmlns:cx7="http://schemas.microsoft.com/office/drawing/2016/5/13/chartex" xmlns:cx8="http://schemas.microsoft.com/office/drawing/2016/5/14/chartex" xmlns:mc="http://schemas.openxmlformats.org/markup-compatibility/2006" xmlns:aink="http://schemas.microsoft.com/office/drawing/2016/ink" xmlns:am3d="http://schemas.microsoft.com/office/drawing/2017/model3d" xmlns:o="urn:schemas-microsoft-com:office:office" xmlns:oel="http://schemas.microsoft.com/office/2019/extlst" xmlns:r="http://schemas.openxmlformats.org/officeDocument/2006/relationships" xmlns:m="http://schemas.openxmlformats.org/officeDocument/2006/math" xmlns:v="urn:schemas-microsoft-com:vml" xmlns:wp14="http://schemas.microsoft.com/office/word/2010/wordprocessingDrawing" xmlns:wp="http://schemas.openxmlformats.org/drawingml/2006/wordprocessingDrawing" xmlns:w10="urn:schemas-microsoft-com:office:word" xmlns:w="http://schemas.openxmlformats.org/wordprocessingml/2006/main" xmlns:w14="http://schemas.microsoft.com/office/word/2010/wordml" xmlns:w15="http://schemas.microsoft.com/office/word/2012/wordml" xmlns:w16cex="http://schemas.microsoft.com/office/word/2018/wordml/cex" xmlns:w16cid="http://schemas.microsoft.com/office/word/2016/wordml/cid" xmlns:w16="http://schemas.microsoft.com/office/word/2018/wordml" xmlns:w16du="http://schemas.microsoft.com/office/word/2023/wordml/word16du" xmlns:w16sdtdh="http://schemas.microsoft.com/office/word/2020/wordml/sdtdatahash" xmlns:w16sdtfl="http://schemas.microsoft.com/office/word/2024/wordml/sdtformatlock" xmlns:w16se="http://schemas.microsoft.com/office/word/2015/wordml/symex" xmlns:wpg="http://schemas.microsoft.com/office/word/2010/wordprocessingGroup" xmlns:wpi="http://schemas.microsoft.com/office/word/2010/wordprocessingInk" xmlns:wne="http://schemas.microsoft.com/office/word/2006/wordml" xmlns:wps="http://schemas.microsoft.com/office/word/2010/wordprocessingShape" mc:Ignorable="w14 w15 w16se w16cid w16 w16cex w16sdtdh w16sdtfl w16du wp14">
+  <w:abstractNum w:abstractNumId="0" w15:restartNumberingAfterBreak="0">
+    <w:nsid w:val="414C4390"/>
+    <w:multiLevelType w:val="hybridMultilevel"/>
+    <w:tmpl w:val="F7B8F894"/>
+    <w:lvl w:ilvl="0" w:tplc="1009000F">
+      <w:start w:val="1"/>
+      <w:numFmt w:val="decimal"/>
+      <w:lvlText w:val="%1."/>
+      <w:lvlJc w:val="left"/>
+      <w:pPr>
+        <w:ind w:left="720" w:hanging="360"/>
+      </w:pPr>
+      <w:rPr>
+        <w:rFonts w:hint="default"/>
+      </w:rPr>
+    </w:lvl>
+    <w:lvl w:ilvl="1" w:tplc="10090019" w:tentative="1">
+      <w:start w:val="1"/>
+      <w:numFmt w:val="lowerLetter"/>
+      <w:lvlText w:val="%2."/>
+      <w:lvlJc w:val="left"/>
+      <w:pPr>
+        <w:ind w:left="1440" w:hanging="360"/>
+      </w:pPr>
+    </w:lvl>
+    <w:lvl w:ilvl="2" w:tplc="1009001B" w:tentative="1">
+      <w:start w:val="1"/>
+      <w:numFmt w:val="lowerRoman"/>
+      <w:lvlText w:val="%3."/>
+      <w:lvlJc w:val="right"/>
+      <w:pPr>
+        <w:ind w:left="2160" w:hanging="180"/>
+      </w:pPr>
+    </w:lvl>
+    <w:lvl w:ilvl="3" w:tplc="1009000F" w:tentative="1">
+      <w:start w:val="1"/>
+      <w:numFmt w:val="decimal"/>
+      <w:lvlText w:val="%4."/>
+      <w:lvlJc w:val="left"/>
+      <w:pPr>
+        <w:ind w:left="2880" w:hanging="360"/>
+      </w:pPr>
+    </w:lvl>
+    <w:lvl w:ilvl="4" w:tplc="10090019" w:tentative="1">
+      <w:start w:val="1"/>
+      <w:numFmt w:val="lowerLetter"/>
+      <w:lvlText w:val="%5."/>
+      <w:lvlJc w:val="left"/>
+      <w:pPr>
+        <w:ind w:left="3600" w:hanging="360"/>
+      </w:pPr>
+    </w:lvl>
+    <w:lvl w:ilvl="5" w:tplc="1009001B" w:tentative="1">
+      <w:start w:val="1"/>
+      <w:numFmt w:val="lowerRoman"/>
+      <w:lvlText w:val="%6."/>
+      <w:lvlJc w:val="right"/>
+      <w:pPr>
+        <w:ind w:left="4320" w:hanging="180"/>
+      </w:pPr>
+    </w:lvl>
+    <w:lvl w:ilvl="6" w:tplc="1009000F" w:tentative="1">
+      <w:start w:val="1"/>
+      <w:numFmt w:val="decimal"/>
+      <w:lvlText w:val="%7."/>
+      <w:lvlJc w:val="left"/>
+      <w:pPr>
+        <w:ind w:left="5040" w:hanging="360"/>
+      </w:pPr>
+    </w:lvl>
+    <w:lvl w:ilvl="7" w:tplc="10090019" w:tentative="1">
+      <w:start w:val="1"/>
+      <w:numFmt w:val="lowerLetter"/>
+      <w:lvlText w:val="%8."/>
+      <w:lvlJc w:val="left"/>
+      <w:pPr>
+        <w:ind w:left="5760" w:hanging="360"/>
+      </w:pPr>
+    </w:lvl>
+    <w:lvl w:ilvl="8" w:tplc="1009001B" w:tentative="1">
+      <w:start w:val="1"/>
+      <w:numFmt w:val="lowerRoman"/>
+      <w:lvlText w:val="%9."/>
+      <w:lvlJc w:val="right"/>
+      <w:pPr>
+        <w:ind w:left="6480" w:hanging="180"/>
+      </w:pPr>
+    </w:lvl>
+  </w:abstractNum>
+  <w:abstractNum w:abstractNumId="1" w15:restartNumberingAfterBreak="0">
+    <w:nsid w:val="46933E48"/>
+    <w:multiLevelType w:val="hybridMultilevel"/>
+    <w:tmpl w:val="7794C7F8"/>
+    <w:lvl w:ilvl="0" w:tplc="1009000F">
+      <w:start w:val="1"/>
+      <w:numFmt w:val="decimal"/>
+      <w:lvlText w:val="%1."/>
+      <w:lvlJc w:val="left"/>
+      <w:pPr>
+        <w:ind w:left="720" w:hanging="360"/>
+      </w:pPr>
+      <w:rPr>
+        <w:rFonts w:hint="default"/>
+      </w:rPr>
+    </w:lvl>
+    <w:lvl w:ilvl="1" w:tplc="10090019" w:tentative="1">
+      <w:start w:val="1"/>
+      <w:numFmt w:val="lowerLetter"/>
+      <w:lvlText w:val="%2."/>
+      <w:lvlJc w:val="left"/>
+      <w:pPr>
+        <w:ind w:left="1440" w:hanging="360"/>
+      </w:pPr>
+    </w:lvl>
+    <w:lvl w:ilvl="2" w:tplc="1009001B" w:tentative="1">
+      <w:start w:val="1"/>
+      <w:numFmt w:val="lowerRoman"/>
+      <w:lvlText w:val="%3."/>
+      <w:lvlJc w:val="right"/>
+      <w:pPr>
+        <w:ind w:left="2160" w:hanging="180"/>
+      </w:pPr>
+    </w:lvl>
+    <w:lvl w:ilvl="3" w:tplc="1009000F" w:tentative="1">
+      <w:start w:val="1"/>
+      <w:numFmt w:val="decimal"/>
+      <w:lvlText w:val="%4."/>
+      <w:lvlJc w:val="left"/>
+      <w:pPr>
+        <w:ind w:left="2880" w:hanging="360"/>
+      </w:pPr>
+    </w:lvl>
+    <w:lvl w:ilvl="4" w:tplc="10090019" w:tentative="1">
+      <w:start w:val="1"/>
+      <w:numFmt w:val="lowerLetter"/>
+      <w:lvlText w:val="%5."/>
+      <w:lvlJc w:val="left"/>
+      <w:pPr>
+        <w:ind w:left="3600" w:hanging="360"/>
+      </w:pPr>
+    </w:lvl>
+    <w:lvl w:ilvl="5" w:tplc="1009001B" w:tentative="1">
+      <w:start w:val="1"/>
+      <w:numFmt w:val="lowerRoman"/>
+      <w:lvlText w:val="%6."/>
+      <w:lvlJc w:val="right"/>
+      <w:pPr>
+        <w:ind w:left="4320" w:hanging="180"/>
+      </w:pPr>
+    </w:lvl>
+    <w:lvl w:ilvl="6" w:tplc="1009000F" w:tentative="1">
+      <w:start w:val="1"/>
+      <w:numFmt w:val="decimal"/>
+      <w:lvlText w:val="%7."/>
+      <w:lvlJc w:val="left"/>
+      <w:pPr>
+        <w:ind w:left="5040" w:hanging="360"/>
+      </w:pPr>
+    </w:lvl>
+    <w:lvl w:ilvl="7" w:tplc="10090019" w:tentative="1">
+      <w:start w:val="1"/>
+      <w:numFmt w:val="lowerLetter"/>
+      <w:lvlText w:val="%8."/>
+      <w:lvlJc w:val="left"/>
+      <w:pPr>
+        <w:ind w:left="5760" w:hanging="360"/>
+      </w:pPr>
+    </w:lvl>
+    <w:lvl w:ilvl="8" w:tplc="1009001B" w:tentative="1">
+      <w:start w:val="1"/>
+      <w:numFmt w:val="lowerRoman"/>
+      <w:lvlText w:val="%9."/>
+      <w:lvlJc w:val="right"/>
+      <w:pPr>
+        <w:ind w:left="6480" w:hanging="180"/>
+      </w:pPr>
+    </w:lvl>
+  </w:abstractNum>
+  <w:abstractNum w:abstractNumId="2" w15:restartNumberingAfterBreak="0">
+    <w:nsid w:val="5CFE4BF4"/>
+    <w:multiLevelType w:val="hybridMultilevel"/>
+    <w:tmpl w:val="3B823414"/>
+    <w:lvl w:ilvl="0" w:tplc="1009000F">
+      <w:start w:val="1"/>
+      <w:numFmt w:val="decimal"/>
+      <w:lvlText w:val="%1."/>
+      <w:lvlJc w:val="left"/>
+      <w:pPr>
+        <w:ind w:left="720" w:hanging="360"/>
+      </w:pPr>
+      <w:rPr>
+        <w:rFonts w:hint="default"/>
+      </w:rPr>
+    </w:lvl>
+    <w:lvl w:ilvl="1" w:tplc="10090019" w:tentative="1">
+      <w:start w:val="1"/>
+      <w:numFmt w:val="lowerLetter"/>
+      <w:lvlText w:val="%2."/>
+      <w:lvlJc w:val="left"/>
+      <w:pPr>
+        <w:ind w:left="1440" w:hanging="360"/>
+      </w:pPr>
+    </w:lvl>
+    <w:lvl w:ilvl="2" w:tplc="1009001B" w:tentative="1">
+      <w:start w:val="1"/>
+      <w:numFmt w:val="lowerRoman"/>
+      <w:lvlText w:val="%3."/>
+      <w:lvlJc w:val="right"/>
+      <w:pPr>
+        <w:ind w:left="2160" w:hanging="180"/>
+      </w:pPr>
+    </w:lvl>
+    <w:lvl w:ilvl="3" w:tplc="1009000F" w:tentative="1">
+      <w:start w:val="1"/>
+      <w:numFmt w:val="decimal"/>
+      <w:lvlText w:val="%4."/>
+      <w:lvlJc w:val="left"/>
+      <w:pPr>
+        <w:ind w:left="2880" w:hanging="360"/>
+      </w:pPr>
+    </w:lvl>
+    <w:lvl w:ilvl="4" w:tplc="10090019" w:tentative="1">
+      <w:start w:val="1"/>
+      <w:numFmt w:val="lowerLetter"/>
+      <w:lvlText w:val="%5."/>
+      <w:lvlJc w:val="left"/>
+      <w:pPr>
+        <w:ind w:left="3600" w:hanging="360"/>
+      </w:pPr>
+    </w:lvl>
+    <w:lvl w:ilvl="5" w:tplc="1009001B" w:tentative="1">
+      <w:start w:val="1"/>
+      <w:numFmt w:val="lowerRoman"/>
+      <w:lvlText w:val="%6."/>
+      <w:lvlJc w:val="right"/>
+      <w:pPr>
+        <w:ind w:left="4320" w:hanging="180"/>
+      </w:pPr>
+    </w:lvl>
+    <w:lvl w:ilvl="6" w:tplc="1009000F" w:tentative="1">
+      <w:start w:val="1"/>
+      <w:numFmt w:val="decimal"/>
+      <w:lvlText w:val="%7."/>
+      <w:lvlJc w:val="left"/>
+      <w:pPr>
+        <w:ind w:left="5040" w:hanging="360"/>
+      </w:pPr>
+    </w:lvl>
+    <w:lvl w:ilvl="7" w:tplc="10090019" w:tentative="1">
+      <w:start w:val="1"/>
+      <w:numFmt w:val="lowerLetter"/>
+      <w:lvlText w:val="%8."/>
+      <w:lvlJc w:val="left"/>
+      <w:pPr>
+        <w:ind w:left="5760" w:hanging="360"/>
+      </w:pPr>
+    </w:lvl>
+    <w:lvl w:ilvl="8" w:tplc="1009001B" w:tentative="1">
+      <w:start w:val="1"/>
+      <w:numFmt w:val="lowerRoman"/>
+      <w:lvlText w:val="%9."/>
+      <w:lvlJc w:val="right"/>
+      <w:pPr>
+        <w:ind w:left="6480" w:hanging="180"/>
+      </w:pPr>
+    </w:lvl>
+  </w:abstractNum>
+  <w:abstractNum w:abstractNumId="3" w15:restartNumberingAfterBreak="0">
+    <w:nsid w:val="707C17DD"/>
+    <w:multiLevelType w:val="hybridMultilevel"/>
+    <w:tmpl w:val="1EFACBFC"/>
+    <w:lvl w:ilvl="0" w:tplc="1009000F">
+      <w:start w:val="1"/>
+      <w:numFmt w:val="decimal"/>
+      <w:lvlText w:val="%1."/>
+      <w:lvlJc w:val="left"/>
+      <w:pPr>
+        <w:ind w:left="720" w:hanging="360"/>
+      </w:pPr>
+      <w:rPr>
+        <w:rFonts w:hint="default"/>
+      </w:rPr>
+    </w:lvl>
+    <w:lvl w:ilvl="1" w:tplc="10090019" w:tentative="1">
+      <w:start w:val="1"/>
+      <w:numFmt w:val="lowerLetter"/>
+      <w:lvlText w:val="%2."/>
+      <w:lvlJc w:val="left"/>
+      <w:pPr>
+        <w:ind w:left="1440" w:hanging="360"/>
+      </w:pPr>
+    </w:lvl>
+    <w:lvl w:ilvl="2" w:tplc="1009001B" w:tentative="1">
+      <w:start w:val="1"/>
+      <w:numFmt w:val="lowerRoman"/>
+      <w:lvlText w:val="%3."/>
+      <w:lvlJc w:val="right"/>
+      <w:pPr>
+        <w:ind w:left="2160" w:hanging="180"/>
+      </w:pPr>
+    </w:lvl>
+    <w:lvl w:ilvl="3" w:tplc="1009000F" w:tentative="1">
+      <w:start w:val="1"/>
+      <w:numFmt w:val="decimal"/>
+      <w:lvlText w:val="%4."/>
+      <w:lvlJc w:val="left"/>
+      <w:pPr>
+        <w:ind w:left="2880" w:hanging="360"/>
+      </w:pPr>
+    </w:lvl>
+    <w:lvl w:ilvl="4" w:tplc="10090019" w:tentative="1">
+      <w:start w:val="1"/>
+      <w:numFmt w:val="lowerLetter"/>
+      <w:lvlText w:val="%5."/>
+      <w:lvlJc w:val="left"/>
+      <w:pPr>
+        <w:ind w:left="3600" w:hanging="360"/>
+      </w:pPr>
+    </w:lvl>
+    <w:lvl w:ilvl="5" w:tplc="1009001B" w:tentative="1">
+      <w:start w:val="1"/>
+      <w:numFmt w:val="lowerRoman"/>
+      <w:lvlText w:val="%6."/>
+      <w:lvlJc w:val="right"/>
+      <w:pPr>
+        <w:ind w:left="4320" w:hanging="180"/>
+      </w:pPr>
+    </w:lvl>
+    <w:lvl w:ilvl="6" w:tplc="1009000F" w:tentative="1">
+      <w:start w:val="1"/>
+      <w:numFmt w:val="decimal"/>
+      <w:lvlText w:val="%7."/>
+      <w:lvlJc w:val="left"/>
+      <w:pPr>
+        <w:ind w:left="5040" w:hanging="360"/>
+      </w:pPr>
+    </w:lvl>
+    <w:lvl w:ilvl="7" w:tplc="10090019" w:tentative="1">
+      <w:start w:val="1"/>
+      <w:numFmt w:val="lowerLetter"/>
+      <w:lvlText w:val="%8."/>
+      <w:lvlJc w:val="left"/>
+      <w:pPr>
+        <w:ind w:left="5760" w:hanging="360"/>
+      </w:pPr>
+    </w:lvl>
+    <w:lvl w:ilvl="8" w:tplc="1009001B" w:tentative="1">
+      <w:start w:val="1"/>
+      <w:numFmt w:val="lowerRoman"/>
+      <w:lvlText w:val="%9."/>
+      <w:lvlJc w:val="right"/>
+      <w:pPr>
+        <w:ind w:left="6480" w:hanging="180"/>
+      </w:pPr>
+    </w:lvl>
+  </w:abstractNum>
+  <w:num w:numId="1" w16cid:durableId="1798446411">
+    <w:abstractNumId w:val="0"/>
+  </w:num>
+  <w:num w:numId="2" w16cid:durableId="122429846">
+    <w:abstractNumId w:val="1"/>
+  </w:num>
+  <w:num w:numId="3" w16cid:durableId="794911654">
+    <w:abstractNumId w:val="2"/>
+  </w:num>
+  <w:num w:numId="4" w16cid:durableId="183860649">
+    <w:abstractNumId w:val="3"/>
+  </w:num>
+</w:numbering>
 </file>
 
 <file path=word/styles.xml><?xml version="1.0" encoding="utf-8"?>
@@ -1265,23 +1744,6 @@
 </file>
 
 <file path=customXml/item1.xml><?xml version="1.0" encoding="utf-8"?>
-<p:properties xmlns:p="http://schemas.microsoft.com/office/2006/metadata/properties" xmlns:xsi="http://www.w3.org/2001/XMLSchema-instance" xmlns:pc="http://schemas.microsoft.com/office/infopath/2007/PartnerControls">
-  <documentManagement>
-    <_activity xmlns="c0234bd0-5a96-46e7-839f-3fab9e5f98c2" xsi:nil="true"/>
-  </documentManagement>
-</p:properties>
-</file>
-
-<file path=customXml/item2.xml><?xml version="1.0" encoding="utf-8"?>
-<?mso-contentType ?>
-<FormTemplates xmlns="http://schemas.microsoft.com/sharepoint/v3/contenttype/forms">
-  <Display>DocumentLibraryForm</Display>
-  <Edit>DocumentLibraryForm</Edit>
-  <New>DocumentLibraryForm</New>
-</FormTemplates>
-</file>
-
-<file path=customXml/item3.xml><?xml version="1.0" encoding="utf-8"?>
 <ct:contentTypeSchema xmlns:ct="http://schemas.microsoft.com/office/2006/metadata/contentType" xmlns:ma="http://schemas.microsoft.com/office/2006/metadata/properties/metaAttributes" ct:_="" ma:_="" ma:contentTypeName="Document" ma:contentTypeID="0x0101008E4E3F4DE3629A4C87031266B4CC2546" ma:contentTypeVersion="5" ma:contentTypeDescription="Create a new document." ma:contentTypeScope="" ma:versionID="fdcec77df13d63293c755040765b7432">
   <xsd:schema xmlns:xsd="http://www.w3.org/2001/XMLSchema" xmlns:xs="http://www.w3.org/2001/XMLSchema" xmlns:p="http://schemas.microsoft.com/office/2006/metadata/properties" xmlns:ns3="c0234bd0-5a96-46e7-839f-3fab9e5f98c2" targetNamespace="http://schemas.microsoft.com/office/2006/metadata/properties" ma:root="true" ma:fieldsID="20594b9f9646a5941cc1f8654d115b18" ns3:_="">
     <xsd:import namespace="c0234bd0-5a96-46e7-839f-3fab9e5f98c2"/>
@@ -1431,25 +1893,24 @@
 </ct:contentTypeSchema>
 </file>
 
-<file path=customXml/itemProps1.xml><?xml version="1.0" encoding="utf-8"?>
-<ds:datastoreItem xmlns:ds="http://schemas.openxmlformats.org/officeDocument/2006/customXml" ds:itemID="{DC1D2B7B-7DE9-4FAA-8F84-C36AC668F71E}">
-  <ds:schemaRefs>
-    <ds:schemaRef ds:uri="http://schemas.microsoft.com/office/2006/metadata/properties"/>
-    <ds:schemaRef ds:uri="http://schemas.microsoft.com/office/infopath/2007/PartnerControls"/>
-    <ds:schemaRef ds:uri="c0234bd0-5a96-46e7-839f-3fab9e5f98c2"/>
-  </ds:schemaRefs>
-</ds:datastoreItem>
+<file path=customXml/item2.xml><?xml version="1.0" encoding="utf-8"?>
+<?mso-contentType ?>
+<FormTemplates xmlns="http://schemas.microsoft.com/sharepoint/v3/contenttype/forms">
+  <Display>DocumentLibraryForm</Display>
+  <Edit>DocumentLibraryForm</Edit>
+  <New>DocumentLibraryForm</New>
+</FormTemplates>
 </file>
 
-<file path=customXml/itemProps2.xml><?xml version="1.0" encoding="utf-8"?>
-<ds:datastoreItem xmlns:ds="http://schemas.openxmlformats.org/officeDocument/2006/customXml" ds:itemID="{9A27A552-1187-424F-804F-3CA706B0CB64}">
-  <ds:schemaRefs>
-    <ds:schemaRef ds:uri="http://schemas.microsoft.com/sharepoint/v3/contenttype/forms"/>
-  </ds:schemaRefs>
-</ds:datastoreItem>
+<file path=customXml/item3.xml><?xml version="1.0" encoding="utf-8"?>
+<p:properties xmlns:p="http://schemas.microsoft.com/office/2006/metadata/properties" xmlns:xsi="http://www.w3.org/2001/XMLSchema-instance" xmlns:pc="http://schemas.microsoft.com/office/infopath/2007/PartnerControls">
+  <documentManagement>
+    <_activity xmlns="c0234bd0-5a96-46e7-839f-3fab9e5f98c2" xsi:nil="true"/>
+  </documentManagement>
+</p:properties>
 </file>
 
-<file path=customXml/itemProps3.xml><?xml version="1.0" encoding="utf-8"?>
+<file path=customXml/itemProps1.xml><?xml version="1.0" encoding="utf-8"?>
 <ds:datastoreItem xmlns:ds="http://schemas.openxmlformats.org/officeDocument/2006/customXml" ds:itemID="{B7861D18-FE30-487D-BB71-C9B6423FA4E1}">
   <ds:schemaRefs>
     <ds:schemaRef ds:uri="http://schemas.microsoft.com/office/2006/metadata/contentType"/>
@@ -1465,4 +1926,22 @@
     <ds:schemaRef ds:uri="http://schemas.microsoft.com/internal/obd"/>
   </ds:schemaRefs>
 </ds:datastoreItem>
+</file>
+
+<file path=customXml/itemProps2.xml><?xml version="1.0" encoding="utf-8"?>
+<ds:datastoreItem xmlns:ds="http://schemas.openxmlformats.org/officeDocument/2006/customXml" ds:itemID="{9A27A552-1187-424F-804F-3CA706B0CB64}">
+  <ds:schemaRefs>
+    <ds:schemaRef ds:uri="http://schemas.microsoft.com/sharepoint/v3/contenttype/forms"/>
+  </ds:schemaRefs>
+</ds:datastoreItem>
+</file>
+
+<file path=customXml/itemProps3.xml><?xml version="1.0" encoding="utf-8"?>
+<ds:datastoreItem xmlns:ds="http://schemas.openxmlformats.org/officeDocument/2006/customXml" ds:itemID="{DC1D2B7B-7DE9-4FAA-8F84-C36AC668F71E}">
+  <ds:schemaRefs>
+    <ds:schemaRef ds:uri="http://schemas.microsoft.com/office/2006/metadata/properties"/>
+    <ds:schemaRef ds:uri="http://schemas.microsoft.com/office/infopath/2007/PartnerControls"/>
+    <ds:schemaRef ds:uri="c0234bd0-5a96-46e7-839f-3fab9e5f98c2"/>
+  </ds:schemaRefs>
+</ds:datastoreItem>
 </file>
</xml_diff>